<commit_message>
HW2 - Add WBS and Gantt chart
</commit_message>
<xml_diff>
--- a/Smart_Parking_Platform_Project_Management_Plan.docx
+++ b/Smart_Parking_Platform_Project_Management_Plan.docx
@@ -1,6 +1,6 @@
 
 <file path=word/document.xml><?xml version="1.0" encoding="utf-8"?>
-<w:document xmlns:wpc="http://schemas.microsoft.com/office/word/2010/wordprocessingCanvas" xmlns:mc="http://schemas.openxmlformats.org/markup-compatibility/2006" xmlns:o="urn:schemas-microsoft-com:office:office" xmlns:r="http://schemas.openxmlformats.org/officeDocument/2006/relationships" xmlns:m="http://schemas.openxmlformats.org/officeDocument/2006/math" xmlns:v="urn:schemas-microsoft-com:vml" xmlns:wp14="http://schemas.microsoft.com/office/word/2010/wordprocessingDrawing" xmlns:wp="http://schemas.openxmlformats.org/drawingml/2006/wordprocessingDrawing" xmlns:w10="urn:schemas-microsoft-com:office:word" xmlns:w="http://schemas.openxmlformats.org/wordprocessingml/2006/main" xmlns:w14="http://schemas.microsoft.com/office/word/2010/wordml" xmlns:w15="http://schemas.microsoft.com/office/word/2012/wordml" xmlns:wpg="http://schemas.microsoft.com/office/word/2010/wordprocessingGroup" xmlns:wpi="http://schemas.microsoft.com/office/word/2010/wordprocessingInk" xmlns:wne="http://schemas.microsoft.com/office/word/2006/wordml" xmlns:wps="http://schemas.microsoft.com/office/word/2010/wordprocessingShape" xmlns:w16se="http://schemas.microsoft.com/office/word/2015/wordml/symex" xmlns:w16cid="http://schemas.microsoft.com/office/word/2016/wordml/cid" xmlns:w16="http://schemas.microsoft.com/office/word/2018/wordml" xmlns:w16cex="http://schemas.microsoft.com/office/word/2018/wordml/cex" xmlns:w16sdtdh="http://schemas.microsoft.com/office/word/2020/wordml/sdtdatahash" xmlns:w16sdtfl="http://schemas.microsoft.com/office/word/2024/wordml/sdtformatlock" mc:Ignorable="w14 w15 wp14 w16se w16cid w16 w16cex w16sdtdh w16sdtfl">
+<w:document xmlns:wpc="http://schemas.microsoft.com/office/word/2010/wordprocessingCanvas" xmlns:mc="http://schemas.openxmlformats.org/markup-compatibility/2006" xmlns:o="urn:schemas-microsoft-com:office:office" xmlns:r="http://schemas.openxmlformats.org/officeDocument/2006/relationships" xmlns:m="http://schemas.openxmlformats.org/officeDocument/2006/math" xmlns:v="urn:schemas-microsoft-com:vml" xmlns:wp14="http://schemas.microsoft.com/office/word/2010/wordprocessingDrawing" xmlns:wp="http://schemas.openxmlformats.org/drawingml/2006/wordprocessingDrawing" xmlns:w10="urn:schemas-microsoft-com:office:word" xmlns:w="http://schemas.openxmlformats.org/wordprocessingml/2006/main" xmlns:w14="http://schemas.microsoft.com/office/word/2010/wordml" xmlns:w15="http://schemas.microsoft.com/office/word/2012/wordml" xmlns:wpg="http://schemas.microsoft.com/office/word/2010/wordprocessingGroup" xmlns:wpi="http://schemas.microsoft.com/office/word/2010/wordprocessingInk" xmlns:wne="http://schemas.microsoft.com/office/word/2006/wordml" xmlns:wps="http://schemas.microsoft.com/office/word/2010/wordprocessingShape" xmlns:w16se="http://schemas.microsoft.com/office/word/2015/wordml/symex" xmlns:w16cid="http://schemas.microsoft.com/office/word/2016/wordml/cid" xmlns:w16="http://schemas.microsoft.com/office/word/2018/wordml" xmlns:w16cex="http://schemas.microsoft.com/office/word/2018/wordml/cex" xmlns:w16sdtdh="http://schemas.microsoft.com/office/word/2020/wordml/sdtdatahash" xmlns:w16sdtfl="http://schemas.microsoft.com/office/word/2024/wordml/sdtformatlock" xmlns:a="http://schemas.openxmlformats.org/drawingml/2006/main" xmlns:pic="http://schemas.openxmlformats.org/drawingml/2006/picture" xmlns:a14="http://schemas.microsoft.com/office/drawing/2010/main" mc:Ignorable="w14 w15 wp14 w16se w16cid w16 w16cex w16sdtdh w16sdtfl">
   <w:body>
     <w:p xmlns:wp14="http://schemas.microsoft.com/office/word/2010/wordml" wp14:paraId="74EFD0A7" wp14:textId="08513FB9">
       <w:pPr>
@@ -1741,6 +1741,1063 @@
           <w:lang w:val="en-US"/>
         </w:rPr>
       </w:pPr>
+    </w:p>
+    <w:p>
+      <w:pPr>
+        <w:pStyle w:val="Normal"/>
+      </w:pPr>
+    </w:p>
+    <w:p>
+      <w:pPr>
+        <w:pStyle w:val="Heading1"/>
+        <w:spacing w:before="240" w:beforeAutospacing="off" w:after="240" w:afterAutospacing="off"/>
+        <w:rPr>
+          <w:noProof w:val="0"/>
+          <w:lang w:val="en-US"/>
+        </w:rPr>
+      </w:pPr>
+    </w:p>
+    <w:p>
+      <w:r>
+        <w:br w:type="page"/>
+      </w:r>
+    </w:p>
+    <w:p>
+      <w:pPr>
+        <w:pStyle w:val="Heading1"/>
+        <w:spacing w:before="240" w:beforeAutospacing="off" w:after="240" w:afterAutospacing="off"/>
+      </w:pPr>
+      <w:r>
+        <w:rPr>
+          <w:noProof w:val="0"/>
+          <w:lang w:val="en-US"/>
+        </w:rPr>
+        <w:t>4.0 Work Breakdown Structure (WBS)</w:t>
+      </w:r>
+    </w:p>
+    <w:p>
+      <w:pPr>
+        <w:pStyle w:val="Normal"/>
+      </w:pPr>
+      <w:r>
+        <w:rPr>
+          <w:noProof w:val="0"/>
+          <w:lang w:val="en-US"/>
+        </w:rPr>
+        <w:t>The Work Breakdown Structure below divides the Smart Parking Platform into a lot of smaller parts. This makes the project easier to organize and shows the main work that needs to be completed.</w:t>
+      </w:r>
+    </w:p>
+    <w:tbl>
+      <w:tblPr>
+        <w:tblStyle w:val="GridTable5Dark-Accent1"/>
+        <w:bidiVisual w:val="0"/>
+        <w:tblW w:w="0" w:type="auto"/>
+        <w:tblLook w:val="06A0" w:firstRow="1" w:lastRow="0" w:firstColumn="1" w:lastColumn="0" w:noHBand="1" w:noVBand="1"/>
+      </w:tblPr>
+      <w:tblGrid>
+        <w:gridCol w:w="3832"/>
+        <w:gridCol w:w="2880"/>
+        <w:gridCol w:w="3806"/>
+      </w:tblGrid>
+      <w:tr>
+        <w:trPr>
+          <w:trHeight w:val="300"/>
+        </w:trPr>
+        <w:tc>
+          <w:tcPr>
+            <w:cnfStyle w:val="001000000000" w:firstRow="0" w:lastRow="0" w:firstColumn="1" w:lastColumn="0" w:oddVBand="0" w:evenVBand="0" w:oddHBand="0" w:evenHBand="0" w:firstRowFirstColumn="0" w:firstRowLastColumn="0" w:lastRowFirstColumn="0" w:lastRowLastColumn="0"/>
+            <w:tcW w:w="3832" w:type="dxa"/>
+            <w:tcMar/>
+          </w:tcPr>
+          <w:p>
+            <w:pPr>
+              <w:spacing w:before="0" w:beforeAutospacing="off" w:after="0" w:afterAutospacing="off"/>
+              <w:jc w:val="center"/>
+            </w:pPr>
+            <w:r>
+              <w:rPr>
+                <w:b w:val="1"/>
+                <w:bCs w:val="1"/>
+              </w:rPr>
+              <w:t>Level 1</w:t>
+            </w:r>
+          </w:p>
+        </w:tc>
+        <w:tc>
+          <w:tcPr>
+            <w:cnfStyle w:val="000000000000" w:firstRow="0" w:lastRow="0" w:firstColumn="0" w:lastColumn="0" w:oddVBand="0" w:evenVBand="0" w:oddHBand="0" w:evenHBand="0" w:firstRowFirstColumn="0" w:firstRowLastColumn="0" w:lastRowFirstColumn="0" w:lastRowLastColumn="0"/>
+            <w:tcW w:w="2880" w:type="dxa"/>
+            <w:tcMar/>
+          </w:tcPr>
+          <w:p>
+            <w:pPr>
+              <w:spacing w:before="0" w:beforeAutospacing="off" w:after="0" w:afterAutospacing="off"/>
+              <w:jc w:val="center"/>
+            </w:pPr>
+            <w:r>
+              <w:rPr>
+                <w:b w:val="1"/>
+                <w:bCs w:val="1"/>
+              </w:rPr>
+              <w:t>Level 2</w:t>
+            </w:r>
+          </w:p>
+        </w:tc>
+        <w:tc>
+          <w:tcPr>
+            <w:cnfStyle w:val="000000000000" w:firstRow="0" w:lastRow="0" w:firstColumn="0" w:lastColumn="0" w:oddVBand="0" w:evenVBand="0" w:oddHBand="0" w:evenHBand="0" w:firstRowFirstColumn="0" w:firstRowLastColumn="0" w:lastRowFirstColumn="0" w:lastRowLastColumn="0"/>
+            <w:tcW w:w="3806" w:type="dxa"/>
+            <w:tcMar/>
+          </w:tcPr>
+          <w:p>
+            <w:pPr>
+              <w:spacing w:before="0" w:beforeAutospacing="off" w:after="0" w:afterAutospacing="off"/>
+              <w:jc w:val="center"/>
+            </w:pPr>
+            <w:r>
+              <w:rPr>
+                <w:b w:val="1"/>
+                <w:bCs w:val="1"/>
+              </w:rPr>
+              <w:t>Level 3</w:t>
+            </w:r>
+          </w:p>
+        </w:tc>
+      </w:tr>
+      <w:tr>
+        <w:trPr>
+          <w:trHeight w:val="300"/>
+        </w:trPr>
+        <w:tc>
+          <w:tcPr>
+            <w:cnfStyle w:val="001000000000" w:firstRow="0" w:lastRow="0" w:firstColumn="1" w:lastColumn="0" w:oddVBand="0" w:evenVBand="0" w:oddHBand="0" w:evenHBand="0" w:firstRowFirstColumn="0" w:firstRowLastColumn="0" w:lastRowFirstColumn="0" w:lastRowLastColumn="0"/>
+            <w:tcW w:w="3832" w:type="dxa"/>
+            <w:tcMar/>
+          </w:tcPr>
+          <w:p>
+            <w:pPr>
+              <w:spacing w:before="0" w:beforeAutospacing="off" w:after="0" w:afterAutospacing="off"/>
+            </w:pPr>
+            <w:r>
+              <w:rPr/>
+              <w:t>1. Account and Access Management</w:t>
+            </w:r>
+          </w:p>
+        </w:tc>
+        <w:tc>
+          <w:tcPr>
+            <w:cnfStyle w:val="000000000000" w:firstRow="0" w:lastRow="0" w:firstColumn="0" w:lastColumn="0" w:oddVBand="0" w:evenVBand="0" w:oddHBand="0" w:evenHBand="0" w:firstRowFirstColumn="0" w:firstRowLastColumn="0" w:lastRowFirstColumn="0" w:lastRowLastColumn="0"/>
+            <w:tcW w:w="2880" w:type="dxa"/>
+            <w:tcMar/>
+          </w:tcPr>
+          <w:p>
+            <w:pPr>
+              <w:spacing w:before="0" w:beforeAutospacing="off" w:after="0" w:afterAutospacing="off"/>
+            </w:pPr>
+            <w:r>
+              <w:rPr/>
+              <w:t>1.1 Driver Account</w:t>
+            </w:r>
+          </w:p>
+        </w:tc>
+        <w:tc>
+          <w:tcPr>
+            <w:cnfStyle w:val="000000000000" w:firstRow="0" w:lastRow="0" w:firstColumn="0" w:lastColumn="0" w:oddVBand="0" w:evenVBand="0" w:oddHBand="0" w:evenHBand="0" w:firstRowFirstColumn="0" w:firstRowLastColumn="0" w:lastRowFirstColumn="0" w:lastRowLastColumn="0"/>
+            <w:tcW w:w="3806" w:type="dxa"/>
+            <w:tcMar/>
+          </w:tcPr>
+          <w:p>
+            <w:pPr>
+              <w:spacing w:before="0" w:beforeAutospacing="off" w:after="0" w:afterAutospacing="off"/>
+            </w:pPr>
+            <w:r>
+              <w:rPr/>
+              <w:t>1.1.1 Registration</w:t>
+            </w:r>
+          </w:p>
+        </w:tc>
+      </w:tr>
+      <w:tr>
+        <w:trPr>
+          <w:trHeight w:val="300"/>
+        </w:trPr>
+        <w:tc>
+          <w:tcPr>
+            <w:cnfStyle w:val="001000000000" w:firstRow="0" w:lastRow="0" w:firstColumn="1" w:lastColumn="0" w:oddVBand="0" w:evenVBand="0" w:oddHBand="0" w:evenHBand="0" w:firstRowFirstColumn="0" w:firstRowLastColumn="0" w:lastRowFirstColumn="0" w:lastRowLastColumn="0"/>
+            <w:tcW w:w="3832" w:type="dxa"/>
+            <w:tcMar/>
+          </w:tcPr>
+          <w:p/>
+        </w:tc>
+        <w:tc>
+          <w:tcPr>
+            <w:cnfStyle w:val="000000000000" w:firstRow="0" w:lastRow="0" w:firstColumn="0" w:lastColumn="0" w:oddVBand="0" w:evenVBand="0" w:oddHBand="0" w:evenHBand="0" w:firstRowFirstColumn="0" w:firstRowLastColumn="0" w:lastRowFirstColumn="0" w:lastRowLastColumn="0"/>
+            <w:tcW w:w="2880" w:type="dxa"/>
+            <w:tcMar/>
+          </w:tcPr>
+          <w:p/>
+        </w:tc>
+        <w:tc>
+          <w:tcPr>
+            <w:cnfStyle w:val="000000000000" w:firstRow="0" w:lastRow="0" w:firstColumn="0" w:lastColumn="0" w:oddVBand="0" w:evenVBand="0" w:oddHBand="0" w:evenHBand="0" w:firstRowFirstColumn="0" w:firstRowLastColumn="0" w:lastRowFirstColumn="0" w:lastRowLastColumn="0"/>
+            <w:tcW w:w="3806" w:type="dxa"/>
+            <w:tcMar/>
+          </w:tcPr>
+          <w:p>
+            <w:pPr>
+              <w:spacing w:before="0" w:beforeAutospacing="off" w:after="0" w:afterAutospacing="off"/>
+            </w:pPr>
+            <w:r>
+              <w:rPr/>
+              <w:t>1.1.2 Login</w:t>
+            </w:r>
+          </w:p>
+        </w:tc>
+      </w:tr>
+      <w:tr>
+        <w:trPr>
+          <w:trHeight w:val="300"/>
+        </w:trPr>
+        <w:tc>
+          <w:tcPr>
+            <w:cnfStyle w:val="001000000000" w:firstRow="0" w:lastRow="0" w:firstColumn="1" w:lastColumn="0" w:oddVBand="0" w:evenVBand="0" w:oddHBand="0" w:evenHBand="0" w:firstRowFirstColumn="0" w:firstRowLastColumn="0" w:lastRowFirstColumn="0" w:lastRowLastColumn="0"/>
+            <w:tcW w:w="3832" w:type="dxa"/>
+            <w:tcMar/>
+          </w:tcPr>
+          <w:p/>
+        </w:tc>
+        <w:tc>
+          <w:tcPr>
+            <w:cnfStyle w:val="000000000000" w:firstRow="0" w:lastRow="0" w:firstColumn="0" w:lastColumn="0" w:oddVBand="0" w:evenVBand="0" w:oddHBand="0" w:evenHBand="0" w:firstRowFirstColumn="0" w:firstRowLastColumn="0" w:lastRowFirstColumn="0" w:lastRowLastColumn="0"/>
+            <w:tcW w:w="2880" w:type="dxa"/>
+            <w:tcMar/>
+          </w:tcPr>
+          <w:p/>
+        </w:tc>
+        <w:tc>
+          <w:tcPr>
+            <w:cnfStyle w:val="000000000000" w:firstRow="0" w:lastRow="0" w:firstColumn="0" w:lastColumn="0" w:oddVBand="0" w:evenVBand="0" w:oddHBand="0" w:evenHBand="0" w:firstRowFirstColumn="0" w:firstRowLastColumn="0" w:lastRowFirstColumn="0" w:lastRowLastColumn="0"/>
+            <w:tcW w:w="3806" w:type="dxa"/>
+            <w:tcMar/>
+          </w:tcPr>
+          <w:p>
+            <w:pPr>
+              <w:spacing w:before="0" w:beforeAutospacing="off" w:after="0" w:afterAutospacing="off"/>
+            </w:pPr>
+            <w:r>
+              <w:rPr/>
+              <w:t>1.1.3 Profile Management</w:t>
+            </w:r>
+          </w:p>
+        </w:tc>
+      </w:tr>
+      <w:tr>
+        <w:trPr>
+          <w:trHeight w:val="300"/>
+        </w:trPr>
+        <w:tc>
+          <w:tcPr>
+            <w:cnfStyle w:val="001000000000" w:firstRow="0" w:lastRow="0" w:firstColumn="1" w:lastColumn="0" w:oddVBand="0" w:evenVBand="0" w:oddHBand="0" w:evenHBand="0" w:firstRowFirstColumn="0" w:firstRowLastColumn="0" w:lastRowFirstColumn="0" w:lastRowLastColumn="0"/>
+            <w:tcW w:w="3832" w:type="dxa"/>
+            <w:tcMar/>
+          </w:tcPr>
+          <w:p/>
+        </w:tc>
+        <w:tc>
+          <w:tcPr>
+            <w:cnfStyle w:val="000000000000" w:firstRow="0" w:lastRow="0" w:firstColumn="0" w:lastColumn="0" w:oddVBand="0" w:evenVBand="0" w:oddHBand="0" w:evenHBand="0" w:firstRowFirstColumn="0" w:firstRowLastColumn="0" w:lastRowFirstColumn="0" w:lastRowLastColumn="0"/>
+            <w:tcW w:w="2880" w:type="dxa"/>
+            <w:tcMar/>
+          </w:tcPr>
+          <w:p>
+            <w:pPr>
+              <w:spacing w:before="0" w:beforeAutospacing="off" w:after="0" w:afterAutospacing="off"/>
+            </w:pPr>
+            <w:r>
+              <w:rPr/>
+              <w:t>1.2 Operator Account</w:t>
+            </w:r>
+          </w:p>
+        </w:tc>
+        <w:tc>
+          <w:tcPr>
+            <w:cnfStyle w:val="000000000000" w:firstRow="0" w:lastRow="0" w:firstColumn="0" w:lastColumn="0" w:oddVBand="0" w:evenVBand="0" w:oddHBand="0" w:evenHBand="0" w:firstRowFirstColumn="0" w:firstRowLastColumn="0" w:lastRowFirstColumn="0" w:lastRowLastColumn="0"/>
+            <w:tcW w:w="3806" w:type="dxa"/>
+            <w:tcMar/>
+          </w:tcPr>
+          <w:p>
+            <w:pPr>
+              <w:spacing w:before="0" w:beforeAutospacing="off" w:after="0" w:afterAutospacing="off"/>
+            </w:pPr>
+            <w:r>
+              <w:rPr/>
+              <w:t>1.2.1 Operator Registration</w:t>
+            </w:r>
+          </w:p>
+        </w:tc>
+      </w:tr>
+      <w:tr>
+        <w:trPr>
+          <w:trHeight w:val="300"/>
+        </w:trPr>
+        <w:tc>
+          <w:tcPr>
+            <w:cnfStyle w:val="001000000000" w:firstRow="0" w:lastRow="0" w:firstColumn="1" w:lastColumn="0" w:oddVBand="0" w:evenVBand="0" w:oddHBand="0" w:evenHBand="0" w:firstRowFirstColumn="0" w:firstRowLastColumn="0" w:lastRowFirstColumn="0" w:lastRowLastColumn="0"/>
+            <w:tcW w:w="3832" w:type="dxa"/>
+            <w:tcMar/>
+          </w:tcPr>
+          <w:p/>
+        </w:tc>
+        <w:tc>
+          <w:tcPr>
+            <w:cnfStyle w:val="000000000000" w:firstRow="0" w:lastRow="0" w:firstColumn="0" w:lastColumn="0" w:oddVBand="0" w:evenVBand="0" w:oddHBand="0" w:evenHBand="0" w:firstRowFirstColumn="0" w:firstRowLastColumn="0" w:lastRowFirstColumn="0" w:lastRowLastColumn="0"/>
+            <w:tcW w:w="2880" w:type="dxa"/>
+            <w:tcMar/>
+          </w:tcPr>
+          <w:p/>
+        </w:tc>
+        <w:tc>
+          <w:tcPr>
+            <w:cnfStyle w:val="000000000000" w:firstRow="0" w:lastRow="0" w:firstColumn="0" w:lastColumn="0" w:oddVBand="0" w:evenVBand="0" w:oddHBand="0" w:evenHBand="0" w:firstRowFirstColumn="0" w:firstRowLastColumn="0" w:lastRowFirstColumn="0" w:lastRowLastColumn="0"/>
+            <w:tcW w:w="3806" w:type="dxa"/>
+            <w:tcMar/>
+          </w:tcPr>
+          <w:p>
+            <w:pPr>
+              <w:spacing w:before="0" w:beforeAutospacing="off" w:after="0" w:afterAutospacing="off"/>
+            </w:pPr>
+            <w:r>
+              <w:rPr/>
+              <w:t>1.2.2 Operator Login</w:t>
+            </w:r>
+          </w:p>
+        </w:tc>
+      </w:tr>
+      <w:tr>
+        <w:trPr>
+          <w:trHeight w:val="300"/>
+        </w:trPr>
+        <w:tc>
+          <w:tcPr>
+            <w:cnfStyle w:val="001000000000" w:firstRow="0" w:lastRow="0" w:firstColumn="1" w:lastColumn="0" w:oddVBand="0" w:evenVBand="0" w:oddHBand="0" w:evenHBand="0" w:firstRowFirstColumn="0" w:firstRowLastColumn="0" w:lastRowFirstColumn="0" w:lastRowLastColumn="0"/>
+            <w:tcW w:w="3832" w:type="dxa"/>
+            <w:tcMar/>
+          </w:tcPr>
+          <w:p/>
+        </w:tc>
+        <w:tc>
+          <w:tcPr>
+            <w:cnfStyle w:val="000000000000" w:firstRow="0" w:lastRow="0" w:firstColumn="0" w:lastColumn="0" w:oddVBand="0" w:evenVBand="0" w:oddHBand="0" w:evenHBand="0" w:firstRowFirstColumn="0" w:firstRowLastColumn="0" w:lastRowFirstColumn="0" w:lastRowLastColumn="0"/>
+            <w:tcW w:w="2880" w:type="dxa"/>
+            <w:tcMar/>
+          </w:tcPr>
+          <w:p/>
+        </w:tc>
+        <w:tc>
+          <w:tcPr>
+            <w:cnfStyle w:val="000000000000" w:firstRow="0" w:lastRow="0" w:firstColumn="0" w:lastColumn="0" w:oddVBand="0" w:evenVBand="0" w:oddHBand="0" w:evenHBand="0" w:firstRowFirstColumn="0" w:firstRowLastColumn="0" w:lastRowFirstColumn="0" w:lastRowLastColumn="0"/>
+            <w:tcW w:w="3806" w:type="dxa"/>
+            <w:tcMar/>
+          </w:tcPr>
+          <w:p>
+            <w:pPr>
+              <w:spacing w:before="0" w:beforeAutospacing="off" w:after="0" w:afterAutospacing="off"/>
+            </w:pPr>
+            <w:r>
+              <w:rPr/>
+              <w:t>1.2.3 Operator Profile Management</w:t>
+            </w:r>
+          </w:p>
+        </w:tc>
+      </w:tr>
+      <w:tr>
+        <w:trPr>
+          <w:trHeight w:val="300"/>
+        </w:trPr>
+        <w:tc>
+          <w:tcPr>
+            <w:cnfStyle w:val="001000000000" w:firstRow="0" w:lastRow="0" w:firstColumn="1" w:lastColumn="0" w:oddVBand="0" w:evenVBand="0" w:oddHBand="0" w:evenHBand="0" w:firstRowFirstColumn="0" w:firstRowLastColumn="0" w:lastRowFirstColumn="0" w:lastRowLastColumn="0"/>
+            <w:tcW w:w="3832" w:type="dxa"/>
+            <w:tcMar/>
+          </w:tcPr>
+          <w:p>
+            <w:pPr>
+              <w:spacing w:before="0" w:beforeAutospacing="off" w:after="0" w:afterAutospacing="off"/>
+            </w:pPr>
+            <w:r>
+              <w:rPr/>
+              <w:t>2. Parking Services</w:t>
+            </w:r>
+          </w:p>
+        </w:tc>
+        <w:tc>
+          <w:tcPr>
+            <w:cnfStyle w:val="000000000000" w:firstRow="0" w:lastRow="0" w:firstColumn="0" w:lastColumn="0" w:oddVBand="0" w:evenVBand="0" w:oddHBand="0" w:evenHBand="0" w:firstRowFirstColumn="0" w:firstRowLastColumn="0" w:lastRowFirstColumn="0" w:lastRowLastColumn="0"/>
+            <w:tcW w:w="2880" w:type="dxa"/>
+            <w:tcMar/>
+          </w:tcPr>
+          <w:p>
+            <w:pPr>
+              <w:spacing w:before="0" w:beforeAutospacing="off" w:after="0" w:afterAutospacing="off"/>
+            </w:pPr>
+            <w:r>
+              <w:rPr/>
+              <w:t>2.1 Parking Search</w:t>
+            </w:r>
+          </w:p>
+        </w:tc>
+        <w:tc>
+          <w:tcPr>
+            <w:cnfStyle w:val="000000000000" w:firstRow="0" w:lastRow="0" w:firstColumn="0" w:lastColumn="0" w:oddVBand="0" w:evenVBand="0" w:oddHBand="0" w:evenHBand="0" w:firstRowFirstColumn="0" w:firstRowLastColumn="0" w:lastRowFirstColumn="0" w:lastRowLastColumn="0"/>
+            <w:tcW w:w="3806" w:type="dxa"/>
+            <w:tcMar/>
+          </w:tcPr>
+          <w:p>
+            <w:pPr>
+              <w:spacing w:before="0" w:beforeAutospacing="off" w:after="0" w:afterAutospacing="off"/>
+            </w:pPr>
+            <w:r>
+              <w:rPr/>
+              <w:t>2.1.1 Real-Time Availability</w:t>
+            </w:r>
+          </w:p>
+        </w:tc>
+      </w:tr>
+      <w:tr>
+        <w:trPr>
+          <w:trHeight w:val="300"/>
+        </w:trPr>
+        <w:tc>
+          <w:tcPr>
+            <w:cnfStyle w:val="001000000000" w:firstRow="0" w:lastRow="0" w:firstColumn="1" w:lastColumn="0" w:oddVBand="0" w:evenVBand="0" w:oddHBand="0" w:evenHBand="0" w:firstRowFirstColumn="0" w:firstRowLastColumn="0" w:lastRowFirstColumn="0" w:lastRowLastColumn="0"/>
+            <w:tcW w:w="3832" w:type="dxa"/>
+            <w:tcMar/>
+          </w:tcPr>
+          <w:p/>
+        </w:tc>
+        <w:tc>
+          <w:tcPr>
+            <w:cnfStyle w:val="000000000000" w:firstRow="0" w:lastRow="0" w:firstColumn="0" w:lastColumn="0" w:oddVBand="0" w:evenVBand="0" w:oddHBand="0" w:evenHBand="0" w:firstRowFirstColumn="0" w:firstRowLastColumn="0" w:lastRowFirstColumn="0" w:lastRowLastColumn="0"/>
+            <w:tcW w:w="2880" w:type="dxa"/>
+            <w:tcMar/>
+          </w:tcPr>
+          <w:p/>
+        </w:tc>
+        <w:tc>
+          <w:tcPr>
+            <w:cnfStyle w:val="000000000000" w:firstRow="0" w:lastRow="0" w:firstColumn="0" w:lastColumn="0" w:oddVBand="0" w:evenVBand="0" w:oddHBand="0" w:evenHBand="0" w:firstRowFirstColumn="0" w:firstRowLastColumn="0" w:lastRowFirstColumn="0" w:lastRowLastColumn="0"/>
+            <w:tcW w:w="3806" w:type="dxa"/>
+            <w:tcMar/>
+          </w:tcPr>
+          <w:p>
+            <w:pPr>
+              <w:spacing w:before="0" w:beforeAutospacing="off" w:after="0" w:afterAutospacing="off"/>
+            </w:pPr>
+            <w:r>
+              <w:rPr/>
+              <w:t>2.1.2 Interactive Map</w:t>
+            </w:r>
+          </w:p>
+        </w:tc>
+      </w:tr>
+      <w:tr>
+        <w:trPr>
+          <w:trHeight w:val="300"/>
+        </w:trPr>
+        <w:tc>
+          <w:tcPr>
+            <w:cnfStyle w:val="001000000000" w:firstRow="0" w:lastRow="0" w:firstColumn="1" w:lastColumn="0" w:oddVBand="0" w:evenVBand="0" w:oddHBand="0" w:evenHBand="0" w:firstRowFirstColumn="0" w:firstRowLastColumn="0" w:lastRowFirstColumn="0" w:lastRowLastColumn="0"/>
+            <w:tcW w:w="3832" w:type="dxa"/>
+            <w:tcMar/>
+          </w:tcPr>
+          <w:p/>
+        </w:tc>
+        <w:tc>
+          <w:tcPr>
+            <w:cnfStyle w:val="000000000000" w:firstRow="0" w:lastRow="0" w:firstColumn="0" w:lastColumn="0" w:oddVBand="0" w:evenVBand="0" w:oddHBand="0" w:evenHBand="0" w:firstRowFirstColumn="0" w:firstRowLastColumn="0" w:lastRowFirstColumn="0" w:lastRowLastColumn="0"/>
+            <w:tcW w:w="2880" w:type="dxa"/>
+            <w:tcMar/>
+          </w:tcPr>
+          <w:p>
+            <w:pPr>
+              <w:spacing w:before="0" w:beforeAutospacing="off" w:after="0" w:afterAutospacing="off"/>
+            </w:pPr>
+            <w:r>
+              <w:rPr/>
+              <w:t>2.2 Parking Reservation</w:t>
+            </w:r>
+          </w:p>
+        </w:tc>
+        <w:tc>
+          <w:tcPr>
+            <w:cnfStyle w:val="000000000000" w:firstRow="0" w:lastRow="0" w:firstColumn="0" w:lastColumn="0" w:oddVBand="0" w:evenVBand="0" w:oddHBand="0" w:evenHBand="0" w:firstRowFirstColumn="0" w:firstRowLastColumn="0" w:lastRowFirstColumn="0" w:lastRowLastColumn="0"/>
+            <w:tcW w:w="3806" w:type="dxa"/>
+            <w:tcMar/>
+          </w:tcPr>
+          <w:p>
+            <w:pPr>
+              <w:spacing w:before="0" w:beforeAutospacing="off" w:after="0" w:afterAutospacing="off"/>
+            </w:pPr>
+            <w:r>
+              <w:rPr/>
+              <w:t>2.2.1 Parking Selection</w:t>
+            </w:r>
+          </w:p>
+        </w:tc>
+      </w:tr>
+      <w:tr>
+        <w:trPr>
+          <w:trHeight w:val="300"/>
+        </w:trPr>
+        <w:tc>
+          <w:tcPr>
+            <w:cnfStyle w:val="001000000000" w:firstRow="0" w:lastRow="0" w:firstColumn="1" w:lastColumn="0" w:oddVBand="0" w:evenVBand="0" w:oddHBand="0" w:evenHBand="0" w:firstRowFirstColumn="0" w:firstRowLastColumn="0" w:lastRowFirstColumn="0" w:lastRowLastColumn="0"/>
+            <w:tcW w:w="3832" w:type="dxa"/>
+            <w:tcMar/>
+          </w:tcPr>
+          <w:p/>
+        </w:tc>
+        <w:tc>
+          <w:tcPr>
+            <w:cnfStyle w:val="000000000000" w:firstRow="0" w:lastRow="0" w:firstColumn="0" w:lastColumn="0" w:oddVBand="0" w:evenVBand="0" w:oddHBand="0" w:evenHBand="0" w:firstRowFirstColumn="0" w:firstRowLastColumn="0" w:lastRowFirstColumn="0" w:lastRowLastColumn="0"/>
+            <w:tcW w:w="2880" w:type="dxa"/>
+            <w:tcMar/>
+          </w:tcPr>
+          <w:p/>
+        </w:tc>
+        <w:tc>
+          <w:tcPr>
+            <w:cnfStyle w:val="000000000000" w:firstRow="0" w:lastRow="0" w:firstColumn="0" w:lastColumn="0" w:oddVBand="0" w:evenVBand="0" w:oddHBand="0" w:evenHBand="0" w:firstRowFirstColumn="0" w:firstRowLastColumn="0" w:lastRowFirstColumn="0" w:lastRowLastColumn="0"/>
+            <w:tcW w:w="3806" w:type="dxa"/>
+            <w:tcMar/>
+          </w:tcPr>
+          <w:p>
+            <w:pPr>
+              <w:spacing w:before="0" w:beforeAutospacing="off" w:after="0" w:afterAutospacing="off"/>
+            </w:pPr>
+            <w:r>
+              <w:rPr/>
+              <w:t>2.2.2 Reservation Management</w:t>
+            </w:r>
+          </w:p>
+        </w:tc>
+      </w:tr>
+      <w:tr>
+        <w:trPr>
+          <w:trHeight w:val="300"/>
+        </w:trPr>
+        <w:tc>
+          <w:tcPr>
+            <w:cnfStyle w:val="001000000000" w:firstRow="0" w:lastRow="0" w:firstColumn="1" w:lastColumn="0" w:oddVBand="0" w:evenVBand="0" w:oddHBand="0" w:evenHBand="0" w:firstRowFirstColumn="0" w:firstRowLastColumn="0" w:lastRowFirstColumn="0" w:lastRowLastColumn="0"/>
+            <w:tcW w:w="3832" w:type="dxa"/>
+            <w:tcMar/>
+          </w:tcPr>
+          <w:p/>
+        </w:tc>
+        <w:tc>
+          <w:tcPr>
+            <w:cnfStyle w:val="000000000000" w:firstRow="0" w:lastRow="0" w:firstColumn="0" w:lastColumn="0" w:oddVBand="0" w:evenVBand="0" w:oddHBand="0" w:evenHBand="0" w:firstRowFirstColumn="0" w:firstRowLastColumn="0" w:lastRowFirstColumn="0" w:lastRowLastColumn="0"/>
+            <w:tcW w:w="2880" w:type="dxa"/>
+            <w:tcMar/>
+          </w:tcPr>
+          <w:p>
+            <w:pPr>
+              <w:spacing w:before="0" w:beforeAutospacing="off" w:after="0" w:afterAutospacing="off"/>
+            </w:pPr>
+            <w:r>
+              <w:rPr/>
+              <w:t>2.3 Navigation</w:t>
+            </w:r>
+          </w:p>
+        </w:tc>
+        <w:tc>
+          <w:tcPr>
+            <w:cnfStyle w:val="000000000000" w:firstRow="0" w:lastRow="0" w:firstColumn="0" w:lastColumn="0" w:oddVBand="0" w:evenVBand="0" w:oddHBand="0" w:evenHBand="0" w:firstRowFirstColumn="0" w:firstRowLastColumn="0" w:lastRowFirstColumn="0" w:lastRowLastColumn="0"/>
+            <w:tcW w:w="3806" w:type="dxa"/>
+            <w:tcMar/>
+          </w:tcPr>
+          <w:p>
+            <w:pPr>
+              <w:spacing w:before="0" w:beforeAutospacing="off" w:after="0" w:afterAutospacing="off"/>
+            </w:pPr>
+            <w:r>
+              <w:rPr/>
+              <w:t>2.3.1 Parking Location</w:t>
+            </w:r>
+          </w:p>
+        </w:tc>
+      </w:tr>
+      <w:tr>
+        <w:trPr>
+          <w:trHeight w:val="300"/>
+        </w:trPr>
+        <w:tc>
+          <w:tcPr>
+            <w:cnfStyle w:val="001000000000" w:firstRow="0" w:lastRow="0" w:firstColumn="1" w:lastColumn="0" w:oddVBand="0" w:evenVBand="0" w:oddHBand="0" w:evenHBand="0" w:firstRowFirstColumn="0" w:firstRowLastColumn="0" w:lastRowFirstColumn="0" w:lastRowLastColumn="0"/>
+            <w:tcW w:w="3832" w:type="dxa"/>
+            <w:tcMar/>
+          </w:tcPr>
+          <w:p/>
+        </w:tc>
+        <w:tc>
+          <w:tcPr>
+            <w:cnfStyle w:val="000000000000" w:firstRow="0" w:lastRow="0" w:firstColumn="0" w:lastColumn="0" w:oddVBand="0" w:evenVBand="0" w:oddHBand="0" w:evenHBand="0" w:firstRowFirstColumn="0" w:firstRowLastColumn="0" w:lastRowFirstColumn="0" w:lastRowLastColumn="0"/>
+            <w:tcW w:w="2880" w:type="dxa"/>
+            <w:tcMar/>
+          </w:tcPr>
+          <w:p/>
+        </w:tc>
+        <w:tc>
+          <w:tcPr>
+            <w:cnfStyle w:val="000000000000" w:firstRow="0" w:lastRow="0" w:firstColumn="0" w:lastColumn="0" w:oddVBand="0" w:evenVBand="0" w:oddHBand="0" w:evenHBand="0" w:firstRowFirstColumn="0" w:firstRowLastColumn="0" w:lastRowFirstColumn="0" w:lastRowLastColumn="0"/>
+            <w:tcW w:w="3806" w:type="dxa"/>
+            <w:tcMar/>
+          </w:tcPr>
+          <w:p>
+            <w:pPr>
+              <w:spacing w:before="0" w:beforeAutospacing="off" w:after="0" w:afterAutospacing="off"/>
+            </w:pPr>
+            <w:r>
+              <w:rPr/>
+              <w:t>2.3.2 Directions</w:t>
+            </w:r>
+          </w:p>
+        </w:tc>
+      </w:tr>
+      <w:tr>
+        <w:trPr>
+          <w:trHeight w:val="300"/>
+        </w:trPr>
+        <w:tc>
+          <w:tcPr>
+            <w:cnfStyle w:val="001000000000" w:firstRow="0" w:lastRow="0" w:firstColumn="1" w:lastColumn="0" w:oddVBand="0" w:evenVBand="0" w:oddHBand="0" w:evenHBand="0" w:firstRowFirstColumn="0" w:firstRowLastColumn="0" w:lastRowFirstColumn="0" w:lastRowLastColumn="0"/>
+            <w:tcW w:w="3832" w:type="dxa"/>
+            <w:tcMar/>
+          </w:tcPr>
+          <w:p>
+            <w:pPr>
+              <w:spacing w:before="0" w:beforeAutospacing="off" w:after="0" w:afterAutospacing="off"/>
+            </w:pPr>
+            <w:r>
+              <w:rPr/>
+              <w:t>3. Payment and Records</w:t>
+            </w:r>
+          </w:p>
+        </w:tc>
+        <w:tc>
+          <w:tcPr>
+            <w:cnfStyle w:val="000000000000" w:firstRow="0" w:lastRow="0" w:firstColumn="0" w:lastColumn="0" w:oddVBand="0" w:evenVBand="0" w:oddHBand="0" w:evenHBand="0" w:firstRowFirstColumn="0" w:firstRowLastColumn="0" w:lastRowFirstColumn="0" w:lastRowLastColumn="0"/>
+            <w:tcW w:w="2880" w:type="dxa"/>
+            <w:tcMar/>
+          </w:tcPr>
+          <w:p>
+            <w:pPr>
+              <w:spacing w:before="0" w:beforeAutospacing="off" w:after="0" w:afterAutospacing="off"/>
+            </w:pPr>
+            <w:r>
+              <w:rPr/>
+              <w:t>3.1 Payment Processing</w:t>
+            </w:r>
+          </w:p>
+        </w:tc>
+        <w:tc>
+          <w:tcPr>
+            <w:cnfStyle w:val="000000000000" w:firstRow="0" w:lastRow="0" w:firstColumn="0" w:lastColumn="0" w:oddVBand="0" w:evenVBand="0" w:oddHBand="0" w:evenHBand="0" w:firstRowFirstColumn="0" w:firstRowLastColumn="0" w:lastRowFirstColumn="0" w:lastRowLastColumn="0"/>
+            <w:tcW w:w="3806" w:type="dxa"/>
+            <w:tcMar/>
+          </w:tcPr>
+          <w:p>
+            <w:pPr>
+              <w:spacing w:before="0" w:beforeAutospacing="off" w:after="0" w:afterAutospacing="off"/>
+            </w:pPr>
+            <w:r>
+              <w:rPr/>
+              <w:t>3.1.1 Digital Payment</w:t>
+            </w:r>
+          </w:p>
+        </w:tc>
+      </w:tr>
+      <w:tr>
+        <w:trPr>
+          <w:trHeight w:val="300"/>
+        </w:trPr>
+        <w:tc>
+          <w:tcPr>
+            <w:cnfStyle w:val="001000000000" w:firstRow="0" w:lastRow="0" w:firstColumn="1" w:lastColumn="0" w:oddVBand="0" w:evenVBand="0" w:oddHBand="0" w:evenHBand="0" w:firstRowFirstColumn="0" w:firstRowLastColumn="0" w:lastRowFirstColumn="0" w:lastRowLastColumn="0"/>
+            <w:tcW w:w="3832" w:type="dxa"/>
+            <w:tcMar/>
+          </w:tcPr>
+          <w:p/>
+        </w:tc>
+        <w:tc>
+          <w:tcPr>
+            <w:cnfStyle w:val="000000000000" w:firstRow="0" w:lastRow="0" w:firstColumn="0" w:lastColumn="0" w:oddVBand="0" w:evenVBand="0" w:oddHBand="0" w:evenHBand="0" w:firstRowFirstColumn="0" w:firstRowLastColumn="0" w:lastRowFirstColumn="0" w:lastRowLastColumn="0"/>
+            <w:tcW w:w="2880" w:type="dxa"/>
+            <w:tcMar/>
+          </w:tcPr>
+          <w:p/>
+        </w:tc>
+        <w:tc>
+          <w:tcPr>
+            <w:cnfStyle w:val="000000000000" w:firstRow="0" w:lastRow="0" w:firstColumn="0" w:lastColumn="0" w:oddVBand="0" w:evenVBand="0" w:oddHBand="0" w:evenHBand="0" w:firstRowFirstColumn="0" w:firstRowLastColumn="0" w:lastRowFirstColumn="0" w:lastRowLastColumn="0"/>
+            <w:tcW w:w="3806" w:type="dxa"/>
+            <w:tcMar/>
+          </w:tcPr>
+          <w:p>
+            <w:pPr>
+              <w:spacing w:before="0" w:beforeAutospacing="off" w:after="0" w:afterAutospacing="off"/>
+            </w:pPr>
+            <w:r>
+              <w:rPr/>
+              <w:t>3.1.2 Payment Confirmation</w:t>
+            </w:r>
+          </w:p>
+        </w:tc>
+      </w:tr>
+      <w:tr>
+        <w:trPr>
+          <w:trHeight w:val="300"/>
+        </w:trPr>
+        <w:tc>
+          <w:tcPr>
+            <w:cnfStyle w:val="001000000000" w:firstRow="0" w:lastRow="0" w:firstColumn="1" w:lastColumn="0" w:oddVBand="0" w:evenVBand="0" w:oddHBand="0" w:evenHBand="0" w:firstRowFirstColumn="0" w:firstRowLastColumn="0" w:lastRowFirstColumn="0" w:lastRowLastColumn="0"/>
+            <w:tcW w:w="3832" w:type="dxa"/>
+            <w:tcMar/>
+          </w:tcPr>
+          <w:p/>
+        </w:tc>
+        <w:tc>
+          <w:tcPr>
+            <w:cnfStyle w:val="000000000000" w:firstRow="0" w:lastRow="0" w:firstColumn="0" w:lastColumn="0" w:oddVBand="0" w:evenVBand="0" w:oddHBand="0" w:evenHBand="0" w:firstRowFirstColumn="0" w:firstRowLastColumn="0" w:lastRowFirstColumn="0" w:lastRowLastColumn="0"/>
+            <w:tcW w:w="2880" w:type="dxa"/>
+            <w:tcMar/>
+          </w:tcPr>
+          <w:p>
+            <w:pPr>
+              <w:spacing w:before="0" w:beforeAutospacing="off" w:after="0" w:afterAutospacing="off"/>
+            </w:pPr>
+            <w:r>
+              <w:rPr/>
+              <w:t>3.2 User Records</w:t>
+            </w:r>
+          </w:p>
+        </w:tc>
+        <w:tc>
+          <w:tcPr>
+            <w:cnfStyle w:val="000000000000" w:firstRow="0" w:lastRow="0" w:firstColumn="0" w:lastColumn="0" w:oddVBand="0" w:evenVBand="0" w:oddHBand="0" w:evenHBand="0" w:firstRowFirstColumn="0" w:firstRowLastColumn="0" w:lastRowFirstColumn="0" w:lastRowLastColumn="0"/>
+            <w:tcW w:w="3806" w:type="dxa"/>
+            <w:tcMar/>
+          </w:tcPr>
+          <w:p>
+            <w:pPr>
+              <w:spacing w:before="0" w:beforeAutospacing="off" w:after="0" w:afterAutospacing="off"/>
+            </w:pPr>
+            <w:r>
+              <w:rPr/>
+              <w:t>3.2.1 Receipts</w:t>
+            </w:r>
+          </w:p>
+        </w:tc>
+      </w:tr>
+      <w:tr>
+        <w:trPr>
+          <w:trHeight w:val="300"/>
+        </w:trPr>
+        <w:tc>
+          <w:tcPr>
+            <w:cnfStyle w:val="001000000000" w:firstRow="0" w:lastRow="0" w:firstColumn="1" w:lastColumn="0" w:oddVBand="0" w:evenVBand="0" w:oddHBand="0" w:evenHBand="0" w:firstRowFirstColumn="0" w:firstRowLastColumn="0" w:lastRowFirstColumn="0" w:lastRowLastColumn="0"/>
+            <w:tcW w:w="3832" w:type="dxa"/>
+            <w:tcMar/>
+          </w:tcPr>
+          <w:p/>
+        </w:tc>
+        <w:tc>
+          <w:tcPr>
+            <w:cnfStyle w:val="000000000000" w:firstRow="0" w:lastRow="0" w:firstColumn="0" w:lastColumn="0" w:oddVBand="0" w:evenVBand="0" w:oddHBand="0" w:evenHBand="0" w:firstRowFirstColumn="0" w:firstRowLastColumn="0" w:lastRowFirstColumn="0" w:lastRowLastColumn="0"/>
+            <w:tcW w:w="2880" w:type="dxa"/>
+            <w:tcMar/>
+          </w:tcPr>
+          <w:p/>
+        </w:tc>
+        <w:tc>
+          <w:tcPr>
+            <w:cnfStyle w:val="000000000000" w:firstRow="0" w:lastRow="0" w:firstColumn="0" w:lastColumn="0" w:oddVBand="0" w:evenVBand="0" w:oddHBand="0" w:evenHBand="0" w:firstRowFirstColumn="0" w:firstRowLastColumn="0" w:lastRowFirstColumn="0" w:lastRowLastColumn="0"/>
+            <w:tcW w:w="3806" w:type="dxa"/>
+            <w:tcMar/>
+          </w:tcPr>
+          <w:p>
+            <w:pPr>
+              <w:spacing w:before="0" w:beforeAutospacing="off" w:after="0" w:afterAutospacing="off"/>
+            </w:pPr>
+            <w:r>
+              <w:rPr/>
+              <w:t>3.2.2 Reservation History</w:t>
+            </w:r>
+          </w:p>
+        </w:tc>
+      </w:tr>
+      <w:tr>
+        <w:trPr>
+          <w:trHeight w:val="300"/>
+        </w:trPr>
+        <w:tc>
+          <w:tcPr>
+            <w:cnfStyle w:val="001000000000" w:firstRow="0" w:lastRow="0" w:firstColumn="1" w:lastColumn="0" w:oddVBand="0" w:evenVBand="0" w:oddHBand="0" w:evenHBand="0" w:firstRowFirstColumn="0" w:firstRowLastColumn="0" w:lastRowFirstColumn="0" w:lastRowLastColumn="0"/>
+            <w:tcW w:w="3832" w:type="dxa"/>
+            <w:tcMar/>
+          </w:tcPr>
+          <w:p>
+            <w:pPr>
+              <w:spacing w:before="0" w:beforeAutospacing="off" w:after="0" w:afterAutospacing="off"/>
+            </w:pPr>
+            <w:r>
+              <w:rPr/>
+              <w:t>4. Operator Management and Reporting</w:t>
+            </w:r>
+          </w:p>
+        </w:tc>
+        <w:tc>
+          <w:tcPr>
+            <w:cnfStyle w:val="000000000000" w:firstRow="0" w:lastRow="0" w:firstColumn="0" w:lastColumn="0" w:oddVBand="0" w:evenVBand="0" w:oddHBand="0" w:evenHBand="0" w:firstRowFirstColumn="0" w:firstRowLastColumn="0" w:lastRowFirstColumn="0" w:lastRowLastColumn="0"/>
+            <w:tcW w:w="2880" w:type="dxa"/>
+            <w:tcMar/>
+          </w:tcPr>
+          <w:p>
+            <w:pPr>
+              <w:spacing w:before="0" w:beforeAutospacing="off" w:after="0" w:afterAutospacing="off"/>
+            </w:pPr>
+            <w:r>
+              <w:rPr/>
+              <w:t>4.1 Garage Management</w:t>
+            </w:r>
+          </w:p>
+        </w:tc>
+        <w:tc>
+          <w:tcPr>
+            <w:cnfStyle w:val="000000000000" w:firstRow="0" w:lastRow="0" w:firstColumn="0" w:lastColumn="0" w:oddVBand="0" w:evenVBand="0" w:oddHBand="0" w:evenHBand="0" w:firstRowFirstColumn="0" w:firstRowLastColumn="0" w:lastRowFirstColumn="0" w:lastRowLastColumn="0"/>
+            <w:tcW w:w="3806" w:type="dxa"/>
+            <w:tcMar/>
+          </w:tcPr>
+          <w:p>
+            <w:pPr>
+              <w:spacing w:before="0" w:beforeAutospacing="off" w:after="0" w:afterAutospacing="off"/>
+            </w:pPr>
+            <w:r>
+              <w:rPr/>
+              <w:t>4.1.1 Parking Space Management</w:t>
+            </w:r>
+          </w:p>
+        </w:tc>
+      </w:tr>
+      <w:tr>
+        <w:trPr>
+          <w:trHeight w:val="300"/>
+        </w:trPr>
+        <w:tc>
+          <w:tcPr>
+            <w:cnfStyle w:val="001000000000" w:firstRow="0" w:lastRow="0" w:firstColumn="1" w:lastColumn="0" w:oddVBand="0" w:evenVBand="0" w:oddHBand="0" w:evenHBand="0" w:firstRowFirstColumn="0" w:firstRowLastColumn="0" w:lastRowFirstColumn="0" w:lastRowLastColumn="0"/>
+            <w:tcW w:w="3832" w:type="dxa"/>
+            <w:tcMar/>
+          </w:tcPr>
+          <w:p/>
+        </w:tc>
+        <w:tc>
+          <w:tcPr>
+            <w:cnfStyle w:val="000000000000" w:firstRow="0" w:lastRow="0" w:firstColumn="0" w:lastColumn="0" w:oddVBand="0" w:evenVBand="0" w:oddHBand="0" w:evenHBand="0" w:firstRowFirstColumn="0" w:firstRowLastColumn="0" w:lastRowFirstColumn="0" w:lastRowLastColumn="0"/>
+            <w:tcW w:w="2880" w:type="dxa"/>
+            <w:tcMar/>
+          </w:tcPr>
+          <w:p/>
+        </w:tc>
+        <w:tc>
+          <w:tcPr>
+            <w:cnfStyle w:val="000000000000" w:firstRow="0" w:lastRow="0" w:firstColumn="0" w:lastColumn="0" w:oddVBand="0" w:evenVBand="0" w:oddHBand="0" w:evenHBand="0" w:firstRowFirstColumn="0" w:firstRowLastColumn="0" w:lastRowFirstColumn="0" w:lastRowLastColumn="0"/>
+            <w:tcW w:w="3806" w:type="dxa"/>
+            <w:tcMar/>
+          </w:tcPr>
+          <w:p>
+            <w:pPr>
+              <w:spacing w:before="0" w:beforeAutospacing="off" w:after="0" w:afterAutospacing="off"/>
+            </w:pPr>
+            <w:r>
+              <w:rPr/>
+              <w:t>4.1.2 Parking Information Management</w:t>
+            </w:r>
+          </w:p>
+        </w:tc>
+      </w:tr>
+      <w:tr>
+        <w:trPr>
+          <w:trHeight w:val="300"/>
+        </w:trPr>
+        <w:tc>
+          <w:tcPr>
+            <w:cnfStyle w:val="001000000000" w:firstRow="0" w:lastRow="0" w:firstColumn="1" w:lastColumn="0" w:oddVBand="0" w:evenVBand="0" w:oddHBand="0" w:evenHBand="0" w:firstRowFirstColumn="0" w:firstRowLastColumn="0" w:lastRowFirstColumn="0" w:lastRowLastColumn="0"/>
+            <w:tcW w:w="3832" w:type="dxa"/>
+            <w:tcMar/>
+          </w:tcPr>
+          <w:p/>
+        </w:tc>
+        <w:tc>
+          <w:tcPr>
+            <w:cnfStyle w:val="000000000000" w:firstRow="0" w:lastRow="0" w:firstColumn="0" w:lastColumn="0" w:oddVBand="0" w:evenVBand="0" w:oddHBand="0" w:evenHBand="0" w:firstRowFirstColumn="0" w:firstRowLastColumn="0" w:lastRowFirstColumn="0" w:lastRowLastColumn="0"/>
+            <w:tcW w:w="2880" w:type="dxa"/>
+            <w:tcMar/>
+          </w:tcPr>
+          <w:p>
+            <w:pPr>
+              <w:spacing w:before="0" w:beforeAutospacing="off" w:after="0" w:afterAutospacing="off"/>
+            </w:pPr>
+            <w:r>
+              <w:rPr/>
+              <w:t>4.2 Monitoring and Reporting</w:t>
+            </w:r>
+          </w:p>
+        </w:tc>
+        <w:tc>
+          <w:tcPr>
+            <w:cnfStyle w:val="000000000000" w:firstRow="0" w:lastRow="0" w:firstColumn="0" w:lastColumn="0" w:oddVBand="0" w:evenVBand="0" w:oddHBand="0" w:evenHBand="0" w:firstRowFirstColumn="0" w:firstRowLastColumn="0" w:lastRowFirstColumn="0" w:lastRowLastColumn="0"/>
+            <w:tcW w:w="3806" w:type="dxa"/>
+            <w:tcMar/>
+          </w:tcPr>
+          <w:p>
+            <w:pPr>
+              <w:spacing w:before="0" w:beforeAutospacing="off" w:after="0" w:afterAutospacing="off"/>
+            </w:pPr>
+            <w:r>
+              <w:rPr/>
+              <w:t>4.2.1 Occupancy Monitoring</w:t>
+            </w:r>
+          </w:p>
+        </w:tc>
+      </w:tr>
+      <w:tr>
+        <w:trPr>
+          <w:trHeight w:val="300"/>
+        </w:trPr>
+        <w:tc>
+          <w:tcPr>
+            <w:cnfStyle w:val="001000000000" w:firstRow="0" w:lastRow="0" w:firstColumn="1" w:lastColumn="0" w:oddVBand="0" w:evenVBand="0" w:oddHBand="0" w:evenHBand="0" w:firstRowFirstColumn="0" w:firstRowLastColumn="0" w:lastRowFirstColumn="0" w:lastRowLastColumn="0"/>
+            <w:tcW w:w="3832" w:type="dxa"/>
+            <w:tcMar/>
+          </w:tcPr>
+          <w:p/>
+        </w:tc>
+        <w:tc>
+          <w:tcPr>
+            <w:cnfStyle w:val="000000000000" w:firstRow="0" w:lastRow="0" w:firstColumn="0" w:lastColumn="0" w:oddVBand="0" w:evenVBand="0" w:oddHBand="0" w:evenHBand="0" w:firstRowFirstColumn="0" w:firstRowLastColumn="0" w:lastRowFirstColumn="0" w:lastRowLastColumn="0"/>
+            <w:tcW w:w="2880" w:type="dxa"/>
+            <w:tcMar/>
+          </w:tcPr>
+          <w:p/>
+        </w:tc>
+        <w:tc>
+          <w:tcPr>
+            <w:cnfStyle w:val="000000000000" w:firstRow="0" w:lastRow="0" w:firstColumn="0" w:lastColumn="0" w:oddVBand="0" w:evenVBand="0" w:oddHBand="0" w:evenHBand="0" w:firstRowFirstColumn="0" w:firstRowLastColumn="0" w:lastRowFirstColumn="0" w:lastRowLastColumn="0"/>
+            <w:tcW w:w="3806" w:type="dxa"/>
+            <w:tcMar/>
+          </w:tcPr>
+          <w:p>
+            <w:pPr>
+              <w:spacing w:before="0" w:beforeAutospacing="off" w:after="0" w:afterAutospacing="off"/>
+            </w:pPr>
+            <w:r>
+              <w:rPr/>
+              <w:t>4.2.2 Analytics and Reports</w:t>
+            </w:r>
+          </w:p>
+        </w:tc>
+      </w:tr>
+    </w:tbl>
+    <w:p>
+      <w:pPr>
+        <w:pStyle w:val="Normal"/>
+        <w:rPr>
+          <w:noProof w:val="0"/>
+          <w:lang w:val="en-US"/>
+        </w:rPr>
+      </w:pPr>
+    </w:p>
+    <w:p>
+      <w:r>
+        <w:br w:type="page"/>
+      </w:r>
+    </w:p>
+    <w:p>
+      <w:pPr>
+        <w:pStyle w:val="Heading1"/>
+      </w:pPr>
+      <w:r>
+        <w:rPr>
+          <w:noProof w:val="0"/>
+          <w:lang w:val="en-US"/>
+        </w:rPr>
+        <w:t>5.0 Project Timeline and Gantt Chart</w:t>
+      </w:r>
+    </w:p>
+    <w:p>
+      <w:pPr>
+        <w:pStyle w:val="Normal"/>
+      </w:pPr>
+      <w:r>
+        <w:rPr>
+          <w:noProof w:val="0"/>
+          <w:lang w:val="en-US"/>
+        </w:rPr>
+        <w:t>The Gantt chart below shows the main tasks for the Smart Parking Platform and how long each part should take.</w:t>
+      </w:r>
+    </w:p>
+    <w:p>
+      <w:pPr>
+        <w:pStyle w:val="Normal"/>
+        <w:rPr>
+          <w:noProof w:val="0"/>
+          <w:lang w:val="en-US"/>
+        </w:rPr>
+      </w:pPr>
+      <w:r>
+        <w:drawing>
+          <wp:inline wp14:editId="00F59F84" wp14:anchorId="638313EA">
+            <wp:extent cx="5943600" cy="4457700"/>
+            <wp:effectExtent l="0" t="0" r="0" b="0"/>
+            <wp:docPr id="1653326668" name="drawing"/>
+            <wp:cNvGraphicFramePr>
+              <a:graphicFrameLocks noChangeAspect="1"/>
+            </wp:cNvGraphicFramePr>
+            <a:graphic>
+              <a:graphicData xmlns:a="http://schemas.openxmlformats.org/drawingml/2006/main" uri="http://schemas.openxmlformats.org/drawingml/2006/picture">
+                <pic:pic xmlns:pic="http://schemas.openxmlformats.org/drawingml/2006/picture">
+                  <pic:nvPicPr>
+                    <pic:cNvPr id="1653326668" name="Picture 1653326668"/>
+                    <pic:cNvPicPr/>
+                  </pic:nvPicPr>
+                  <pic:blipFill>
+                    <a:blip xmlns:r="http://schemas.openxmlformats.org/officeDocument/2006/relationships" r:embed="rId2077243551">
+                      <a:extLst>
+                        <a:ext uri="{28A0092B-C50C-407E-A947-70E740481C1C}">
+                          <a14:useLocalDpi xmlns:a14="http://schemas.microsoft.com/office/drawing/2010/main"/>
+                        </a:ext>
+                      </a:extLst>
+                    </a:blip>
+                    <a:stretch>
+                      <a:fillRect/>
+                    </a:stretch>
+                  </pic:blipFill>
+                  <pic:spPr>
+                    <a:xfrm>
+                      <a:off x="0" y="0"/>
+                      <a:ext cx="5943600" cy="4457700"/>
+                    </a:xfrm>
+                    <a:prstGeom prst="rect">
+                      <a:avLst/>
+                    </a:prstGeom>
+                  </pic:spPr>
+                </pic:pic>
+              </a:graphicData>
+            </a:graphic>
+          </wp:inline>
+        </w:drawing>
+      </w:r>
     </w:p>
     <w:sectPr>
       <w:pgSz w:w="12240" w:h="15840" w:orient="portrait"/>
@@ -2291,6 +3348,144 @@
       <w:outlineLvl w:val="1"/>
     </w:pPr>
   </w:style>
+  <w:style xmlns:w="http://schemas.openxmlformats.org/wordprocessingml/2006/main" w:type="table" w:styleId="TableGrid">
+    <w:name xmlns:w="http://schemas.openxmlformats.org/wordprocessingml/2006/main" w:val="Table Grid"/>
+    <w:basedOn xmlns:w="http://schemas.openxmlformats.org/wordprocessingml/2006/main" w:val="TableNormal"/>
+    <w:uiPriority xmlns:w="http://schemas.openxmlformats.org/wordprocessingml/2006/main" w:val="59"/>
+    <w:rsid xmlns:w="http://schemas.openxmlformats.org/wordprocessingml/2006/main" w:val="00FB4123"/>
+    <w:pPr xmlns:w="http://schemas.openxmlformats.org/wordprocessingml/2006/main">
+      <w:spacing w:after="0" w:line="240" w:lineRule="auto"/>
+    </w:pPr>
+    <w:tblPr xmlns:w="http://schemas.openxmlformats.org/wordprocessingml/2006/main">
+      <w:tblInd w:w="0" w:type="dxa"/>
+      <w:tblBorders>
+        <w:top w:val="single" w:color="000000" w:themeColor="text1" w:sz="4" w:space="0"/>
+        <w:left w:val="single" w:color="000000" w:themeColor="text1" w:sz="4" w:space="0"/>
+        <w:bottom w:val="single" w:color="000000" w:themeColor="text1" w:sz="4" w:space="0"/>
+        <w:right w:val="single" w:color="000000" w:themeColor="text1" w:sz="4" w:space="0"/>
+        <w:insideH w:val="single" w:color="000000" w:themeColor="text1" w:sz="4" w:space="0"/>
+        <w:insideV w:val="single" w:color="000000" w:themeColor="text1" w:sz="4" w:space="0"/>
+      </w:tblBorders>
+      <w:tblCellMar>
+        <w:top w:w="0" w:type="dxa"/>
+        <w:left w:w="108" w:type="dxa"/>
+        <w:bottom w:w="0" w:type="dxa"/>
+        <w:right w:w="108" w:type="dxa"/>
+      </w:tblCellMar>
+    </w:tblPr>
+  </w:style>
+  <w:style xmlns:w14="http://schemas.microsoft.com/office/word/2010/wordml" xmlns:mc="http://schemas.openxmlformats.org/markup-compatibility/2006" xmlns:w="http://schemas.openxmlformats.org/wordprocessingml/2006/main" w:type="table" w:styleId="GridTable5Dark-Accent1" mc:Ignorable="w14">
+    <w:name xmlns:w="http://schemas.openxmlformats.org/wordprocessingml/2006/main" w:val="Grid Table 5 Dark Accent 1"/>
+    <w:basedOn xmlns:w="http://schemas.openxmlformats.org/wordprocessingml/2006/main" w:val="TableNormal"/>
+    <w:uiPriority xmlns:w="http://schemas.openxmlformats.org/wordprocessingml/2006/main" w:val="50"/>
+    <w:pPr xmlns:w="http://schemas.openxmlformats.org/wordprocessingml/2006/main">
+      <w:spacing xmlns:w="http://schemas.openxmlformats.org/wordprocessingml/2006/main" w:after="0" w:line="240" w:lineRule="auto"/>
+    </w:pPr>
+    <w:tblPr xmlns:w="http://schemas.openxmlformats.org/wordprocessingml/2006/main">
+      <w:tblStyleRowBandSize w:val="1"/>
+      <w:tblStyleColBandSize w:val="1"/>
+      <w:tblInd w:w="0" w:type="dxa"/>
+      <w:tblBorders>
+        <w:top w:val="single" w:color="FFFFFF" w:themeColor="background1" w:sz="4" w:space="0"/>
+        <w:left w:val="single" w:color="FFFFFF" w:themeColor="background1" w:sz="4" w:space="0"/>
+        <w:bottom w:val="single" w:color="FFFFFF" w:themeColor="background1" w:sz="4" w:space="0"/>
+        <w:right w:val="single" w:color="FFFFFF" w:themeColor="background1" w:sz="4" w:space="0"/>
+        <w:insideH w:val="single" w:color="FFFFFF" w:themeColor="background1" w:sz="4" w:space="0"/>
+        <w:insideV w:val="single" w:color="FFFFFF" w:themeColor="background1" w:sz="4" w:space="0"/>
+      </w:tblBorders>
+      <w:tblCellMar>
+        <w:top w:w="0" w:type="dxa"/>
+        <w:left w:w="108" w:type="dxa"/>
+        <w:bottom w:w="0" w:type="dxa"/>
+        <w:right w:w="108" w:type="dxa"/>
+      </w:tblCellMar>
+    </w:tblPr>
+    <w:tcPr xmlns:w="http://schemas.openxmlformats.org/wordprocessingml/2006/main">
+      <w:shd w:val="clear" w:color="auto" w:fill="DEEAF6" w:themeFill="accent1" w:themeFillTint="33"/>
+    </w:tcPr>
+    <w:tblStylePr xmlns:w="http://schemas.openxmlformats.org/wordprocessingml/2006/main" w:type="firstRow">
+      <w:rPr>
+        <w:b/>
+        <w:bCs/>
+        <w:color w:val="FFFFFF" w:themeColor="background1"/>
+      </w:rPr>
+      <w:tblPr/>
+      <w:tcPr>
+        <w:tcBorders>
+          <w:top w:val="single" w:color="FFFFFF" w:themeColor="background1" w:sz="4" w:space="0"/>
+          <w:left w:val="single" w:color="FFFFFF" w:themeColor="background1" w:sz="4" w:space="0"/>
+          <w:right w:val="single" w:color="FFFFFF" w:themeColor="background1" w:sz="4" w:space="0"/>
+          <w:insideH w:val="nil"/>
+          <w:insideV w:val="nil"/>
+        </w:tcBorders>
+        <w:shd w:val="clear" w:color="auto" w:fill="5B9BD5" w:themeFill="accent1"/>
+      </w:tcPr>
+    </w:tblStylePr>
+    <w:tblStylePr xmlns:w="http://schemas.openxmlformats.org/wordprocessingml/2006/main" w:type="lastRow">
+      <w:rPr>
+        <w:b/>
+        <w:bCs/>
+        <w:color w:val="FFFFFF" w:themeColor="background1"/>
+      </w:rPr>
+      <w:tblPr/>
+      <w:tcPr>
+        <w:tcBorders>
+          <w:left w:val="single" w:color="FFFFFF" w:themeColor="background1" w:sz="4" w:space="0"/>
+          <w:bottom w:val="single" w:color="FFFFFF" w:themeColor="background1" w:sz="4" w:space="0"/>
+          <w:right w:val="single" w:color="FFFFFF" w:themeColor="background1" w:sz="4" w:space="0"/>
+          <w:insideH w:val="nil"/>
+          <w:insideV w:val="nil"/>
+        </w:tcBorders>
+        <w:shd w:val="clear" w:color="auto" w:fill="5B9BD5" w:themeFill="accent1"/>
+      </w:tcPr>
+    </w:tblStylePr>
+    <w:tblStylePr xmlns:w="http://schemas.openxmlformats.org/wordprocessingml/2006/main" w:type="firstCol">
+      <w:rPr>
+        <w:b/>
+        <w:bCs/>
+        <w:color w:val="FFFFFF" w:themeColor="background1"/>
+      </w:rPr>
+      <w:tblPr/>
+      <w:tcPr>
+        <w:tcBorders>
+          <w:top w:val="single" w:color="FFFFFF" w:themeColor="background1" w:sz="4" w:space="0"/>
+          <w:left w:val="single" w:color="FFFFFF" w:themeColor="background1" w:sz="4" w:space="0"/>
+          <w:bottom w:val="single" w:color="FFFFFF" w:themeColor="background1" w:sz="4" w:space="0"/>
+          <w:insideV w:val="nil"/>
+        </w:tcBorders>
+        <w:shd w:val="clear" w:color="auto" w:fill="5B9BD5" w:themeFill="accent1"/>
+      </w:tcPr>
+    </w:tblStylePr>
+    <w:tblStylePr xmlns:w="http://schemas.openxmlformats.org/wordprocessingml/2006/main" w:type="lastCol">
+      <w:rPr>
+        <w:b/>
+        <w:bCs/>
+        <w:color w:val="FFFFFF" w:themeColor="background1"/>
+      </w:rPr>
+      <w:tblPr/>
+      <w:tcPr>
+        <w:tcBorders>
+          <w:top w:val="single" w:color="FFFFFF" w:themeColor="background1" w:sz="4" w:space="0"/>
+          <w:bottom w:val="single" w:color="FFFFFF" w:themeColor="background1" w:sz="4" w:space="0"/>
+          <w:right w:val="single" w:color="FFFFFF" w:themeColor="background1" w:sz="4" w:space="0"/>
+          <w:insideV w:val="nil"/>
+        </w:tcBorders>
+        <w:shd w:val="clear" w:color="auto" w:fill="5B9BD5" w:themeFill="accent1"/>
+      </w:tcPr>
+    </w:tblStylePr>
+    <w:tblStylePr xmlns:w="http://schemas.openxmlformats.org/wordprocessingml/2006/main" w:type="band1Vert">
+      <w:tblPr/>
+      <w:tcPr>
+        <w:shd w:val="clear" w:color="auto" w:fill="BDD6EE" w:themeFill="accent1" w:themeFillTint="66"/>
+      </w:tcPr>
+    </w:tblStylePr>
+    <w:tblStylePr xmlns:w="http://schemas.openxmlformats.org/wordprocessingml/2006/main" w:type="band1Horz">
+      <w:tblPr/>
+      <w:tcPr>
+        <w:shd w:val="clear" w:color="auto" w:fill="BDD6EE" w:themeFill="accent1" w:themeFillTint="66"/>
+      </w:tcPr>
+    </w:tblStylePr>
+  </w:style>
 </w:styles>
 </file>
 

</xml_diff>

<commit_message>
HW3 - Add Agile backlog and Sprint 1
</commit_message>
<xml_diff>
--- a/Smart_Parking_Platform_Project_Management_Plan.docx
+++ b/Smart_Parking_Platform_Project_Management_Plan.docx
@@ -2757,7 +2757,7 @@
       </w:pPr>
       <w:r>
         <w:drawing>
-          <wp:inline wp14:editId="00F59F84" wp14:anchorId="638313EA">
+          <wp:inline wp14:editId="53562904" wp14:anchorId="638313EA">
             <wp:extent cx="5943600" cy="4457700"/>
             <wp:effectExtent l="0" t="0" r="0" b="0"/>
             <wp:docPr id="1653326668" name="drawing"/>
@@ -2787,6 +2787,97 @@
                     <a:xfrm>
                       <a:off x="0" y="0"/>
                       <a:ext cx="5943600" cy="4457700"/>
+                    </a:xfrm>
+                    <a:prstGeom prst="rect">
+                      <a:avLst/>
+                    </a:prstGeom>
+                  </pic:spPr>
+                </pic:pic>
+              </a:graphicData>
+            </a:graphic>
+          </wp:inline>
+        </w:drawing>
+      </w:r>
+    </w:p>
+    <w:p>
+      <w:r>
+        <w:br w:type="page"/>
+      </w:r>
+    </w:p>
+    <w:p>
+      <w:pPr>
+        <w:pStyle w:val="Heading1"/>
+      </w:pPr>
+      <w:r>
+        <w:rPr>
+          <w:noProof w:val="0"/>
+          <w:lang w:val="en-US"/>
+        </w:rPr>
+        <w:t>6.0 Agile/Scrum Backlog and Sprint 1</w:t>
+      </w:r>
+    </w:p>
+    <w:p>
+      <w:pPr>
+        <w:pStyle w:val="Normal"/>
+      </w:pPr>
+      <w:r>
+        <w:rPr>
+          <w:noProof w:val="0"/>
+          <w:lang w:val="en-US"/>
+        </w:rPr>
+        <w:t xml:space="preserve">The Trello board below shows the product backlog for the Smart Parking Platform. The backlog includes a lot of items </w:t>
+      </w:r>
+      <w:r>
+        <w:rPr>
+          <w:noProof w:val="0"/>
+          <w:lang w:val="en-US"/>
+        </w:rPr>
+        <w:t>including;</w:t>
+      </w:r>
+      <w:r>
+        <w:rPr>
+          <w:noProof w:val="0"/>
+          <w:lang w:val="en-US"/>
+        </w:rPr>
+        <w:t xml:space="preserve"> login, user interface, backend, and reporting requirements. A Sprint 1 backlog was also created to organize the first group of tasks that will be worked on.</w:t>
+      </w:r>
+    </w:p>
+    <w:p>
+      <w:pPr>
+        <w:pStyle w:val="Normal"/>
+      </w:pPr>
+      <w:r>
+        <w:drawing>
+          <wp:inline wp14:editId="596B66F8" wp14:anchorId="7A11F1D9">
+            <wp:extent cx="5943600" cy="3219450"/>
+            <wp:effectExtent l="0" t="0" r="0" b="0"/>
+            <wp:docPr id="1983495277" name="drawing"/>
+            <wp:cNvGraphicFramePr>
+              <a:graphicFrameLocks noChangeAspect="1"/>
+            </wp:cNvGraphicFramePr>
+            <a:graphic>
+              <a:graphicData xmlns:a="http://schemas.openxmlformats.org/drawingml/2006/main" uri="http://schemas.openxmlformats.org/drawingml/2006/picture">
+                <pic:pic xmlns:pic="http://schemas.openxmlformats.org/drawingml/2006/picture">
+                  <pic:nvPicPr>
+                    <pic:cNvPr id="1983495277" name="Picture 1983495277"/>
+                    <pic:cNvPicPr/>
+                  </pic:nvPicPr>
+                  <pic:blipFill>
+                    <a:blip xmlns:r="http://schemas.openxmlformats.org/officeDocument/2006/relationships" r:embed="rId2034128415">
+                      <a:extLst>
+                        <a:ext uri="{28A0092B-C50C-407E-A947-70E740481C1C}">
+                          <a14:useLocalDpi xmlns:a14="http://schemas.microsoft.com/office/drawing/2010/main"/>
+                        </a:ext>
+                      </a:extLst>
+                    </a:blip>
+                    <a:stretch>
+                      <a:fillRect/>
+                    </a:stretch>
+                  </pic:blipFill>
+                  <pic:spPr>
+                    <a:xfrm>
+                      <a:off x="0" y="0"/>
+                      <a:ext cx="5943600" cy="3219450"/>
                     </a:xfrm>
                     <a:prstGeom prst="rect">
                       <a:avLst/>

</xml_diff>